<commit_message>
refactor: migrate test infrastructure from PostgreSQL to Firestore emulator and introduce fixture-based seeding.
</commit_message>
<xml_diff>
--- a/demo-output/DEMO - Otter Client 1 (Check-In)/ROF/ROF.docx
+++ b/demo-output/DEMO - Otter Client 1 (Check-In)/ROF/ROF.docx
@@ -97,7 +97,7 @@
         <w:tab/>
         <w:tab/>
         <w:tab/>
-        <w:t xml:space="preserve">Date: July 13, 2026</w:t>
+        <w:t xml:space="preserve">Date: July 31, 2026</w:t>
       </w:r>
     </w:p>
     <w:p>
@@ -165,7 +165,7 @@
           <w:bCs w:val="1"/>
           <w:rtl w:val="0"/>
         </w:rPr>
-        <w:t xml:space="preserve">Symptoms: yeast infections; energy has been feeling pretty stable throughout the day; hot at night; stressed</w:t>
+        <w:t xml:space="preserve">Symptoms: the environmental like stressors for everyone has been; my energy has been feeling pretty stable throughout the day; I drank caffeine too late, so I didn't want to sleep last night; I got one in July 4th again; I was definitely really stressed for a little bit</w:t>
       </w:r>
     </w:p>
     <w:p>
@@ -1618,7 +1618,7 @@
               <w:rPr>
                 <w:rFonts w:ascii="Roboto" w:cs="Roboto" w:eastAsia="Roboto" w:hAnsi="Roboto"/>
               </w:rPr>
-              <w:t xml:space="preserve">zinc</w:t>
+              <w:t xml:space="preserve">Zinc</w:t>
             </w:r>
           </w:p>
         </w:tc>
@@ -1732,7 +1732,7 @@
               <w:rPr>
                 <w:rFonts w:ascii="Roboto" w:cs="Roboto" w:eastAsia="Roboto" w:hAnsi="Roboto"/>
               </w:rPr>
-              <w:t xml:space="preserve">Simplex F</w:t>
+              <w:t xml:space="preserve">B complex</w:t>
             </w:r>
           </w:p>
         </w:tc>
@@ -1846,7 +1846,349 @@
               <w:rPr>
                 <w:rFonts w:ascii="Roboto" w:cs="Roboto" w:eastAsia="Roboto" w:hAnsi="Roboto"/>
               </w:rPr>
-              <w:t xml:space="preserve">oregano</w:t>
+              <w:t xml:space="preserve">Simplex F</w:t>
+            </w:r>
+          </w:p>
+        </w:tc>
+        <w:tc>
+          <w:tcPr>
+            <w:tcBorders>
+              <w:top w:color="000000" w:space="0" w:sz="6" w:val="single"/>
+              <w:left w:color="cccccc" w:space="0" w:sz="6" w:val="single"/>
+              <w:bottom w:color="000000" w:space="0" w:sz="6" w:val="single"/>
+              <w:right w:color="000000" w:space="0" w:sz="6" w:val="single"/>
+            </w:tcBorders>
+            <w:tcMar>
+              <w:top w:w="0.0" w:type="dxa"/>
+              <w:left w:w="40.0" w:type="dxa"/>
+              <w:bottom w:w="0.0" w:type="dxa"/>
+              <w:right w:w="40.0" w:type="dxa"/>
+            </w:tcMar>
+            <w:vAlign w:val="center"/>
+          </w:tcPr>
+          <w:p>
+            <w:pPr>
+              <w:pageBreakBefore w:val="0"/>
+              <w:widowControl w:val="0"/>
+              <w:spacing w:line="276" w:lineRule="auto"/>
+              <w:rPr>
+                <w:rFonts w:ascii="Roboto" w:cs="Roboto" w:eastAsia="Roboto" w:hAnsi="Roboto"/>
+                <w:b w:val="1"/>
+                <w:bCs w:val="1"/>
+              </w:rPr>
+            </w:pPr>
+            <w:r>
+              <w:rPr>
+                <w:rtl w:val="0"/>
+              </w:rPr>
+            </w:r>
+            <w:r>
+              <w:rPr>
+                <w:rFonts w:ascii="Roboto" w:cs="Roboto" w:eastAsia="Roboto" w:hAnsi="Roboto"/>
+              </w:rPr>
+              <w:t/>
+            </w:r>
+          </w:p>
+        </w:tc>
+        <w:tc>
+          <w:tcPr>
+            <w:vAlign w:val="top"/>
+          </w:tcPr>
+          <w:p>
+            <w:pPr>
+              <w:pageBreakBefore w:val="0"/>
+              <w:rPr>
+                <w:rFonts w:ascii="Roboto" w:cs="Roboto" w:eastAsia="Roboto" w:hAnsi="Roboto"/>
+                <w:b w:val="1"/>
+                <w:bCs w:val="1"/>
+                <w:vertAlign w:val="baseline"/>
+              </w:rPr>
+            </w:pPr>
+            <w:r>
+              <w:rPr>
+                <w:rtl w:val="0"/>
+              </w:rPr>
+            </w:r>
+            <w:r>
+              <w:rPr>
+                <w:rFonts w:ascii="Roboto" w:cs="Roboto" w:eastAsia="Roboto" w:hAnsi="Roboto"/>
+              </w:rPr>
+              <w:t/>
+            </w:r>
+          </w:p>
+        </w:tc>
+      </w:tr>
+      <w:tr>
+        <w:trPr>
+          <w:cantSplit w:val="0"/>
+          <w:trHeight w:val="180" w:hRule="atLeast"/>
+          <w:tblHeader w:val="0"/>
+        </w:trPr>
+        <w:tc>
+          <w:tcPr>
+            <w:tcBorders>
+              <w:top w:color="000000" w:space="0" w:sz="6" w:val="single"/>
+              <w:left w:color="000000" w:space="0" w:sz="6" w:val="single"/>
+              <w:bottom w:color="000000" w:space="0" w:sz="6" w:val="single"/>
+              <w:right w:color="000000" w:space="0" w:sz="6" w:val="single"/>
+            </w:tcBorders>
+            <w:tcMar>
+              <w:top w:w="0.0" w:type="dxa"/>
+              <w:left w:w="40.0" w:type="dxa"/>
+              <w:bottom w:w="0.0" w:type="dxa"/>
+              <w:right w:w="40.0" w:type="dxa"/>
+            </w:tcMar>
+            <w:vAlign w:val="center"/>
+          </w:tcPr>
+          <w:p>
+            <w:pPr>
+              <w:pageBreakBefore w:val="0"/>
+              <w:widowControl w:val="0"/>
+              <w:spacing w:line="276" w:lineRule="auto"/>
+              <w:rPr>
+                <w:rFonts w:ascii="Roboto" w:cs="Roboto" w:eastAsia="Roboto" w:hAnsi="Roboto"/>
+                <w:b w:val="1"/>
+                <w:bCs w:val="1"/>
+              </w:rPr>
+            </w:pPr>
+            <w:r>
+              <w:rPr>
+                <w:rtl w:val="0"/>
+              </w:rPr>
+            </w:r>
+            <w:r>
+              <w:rPr>
+                <w:rFonts w:ascii="Roboto" w:cs="Roboto" w:eastAsia="Roboto" w:hAnsi="Roboto"/>
+              </w:rPr>
+              <w:t xml:space="preserve">Oregano</w:t>
+            </w:r>
+          </w:p>
+        </w:tc>
+        <w:tc>
+          <w:tcPr>
+            <w:tcBorders>
+              <w:top w:color="000000" w:space="0" w:sz="6" w:val="single"/>
+              <w:left w:color="cccccc" w:space="0" w:sz="6" w:val="single"/>
+              <w:bottom w:color="000000" w:space="0" w:sz="6" w:val="single"/>
+              <w:right w:color="000000" w:space="0" w:sz="6" w:val="single"/>
+            </w:tcBorders>
+            <w:tcMar>
+              <w:top w:w="0.0" w:type="dxa"/>
+              <w:left w:w="40.0" w:type="dxa"/>
+              <w:bottom w:w="0.0" w:type="dxa"/>
+              <w:right w:w="40.0" w:type="dxa"/>
+            </w:tcMar>
+            <w:vAlign w:val="center"/>
+          </w:tcPr>
+          <w:p>
+            <w:pPr>
+              <w:pageBreakBefore w:val="0"/>
+              <w:widowControl w:val="0"/>
+              <w:spacing w:line="276" w:lineRule="auto"/>
+              <w:rPr>
+                <w:rFonts w:ascii="Roboto" w:cs="Roboto" w:eastAsia="Roboto" w:hAnsi="Roboto"/>
+                <w:b w:val="1"/>
+                <w:bCs w:val="1"/>
+              </w:rPr>
+            </w:pPr>
+            <w:r>
+              <w:rPr>
+                <w:rtl w:val="0"/>
+              </w:rPr>
+            </w:r>
+            <w:r>
+              <w:rPr>
+                <w:rFonts w:ascii="Roboto" w:cs="Roboto" w:eastAsia="Roboto" w:hAnsi="Roboto"/>
+              </w:rPr>
+              <w:t/>
+            </w:r>
+          </w:p>
+        </w:tc>
+        <w:tc>
+          <w:tcPr>
+            <w:vAlign w:val="top"/>
+          </w:tcPr>
+          <w:p>
+            <w:pPr>
+              <w:pageBreakBefore w:val="0"/>
+              <w:rPr>
+                <w:rFonts w:ascii="Roboto" w:cs="Roboto" w:eastAsia="Roboto" w:hAnsi="Roboto"/>
+                <w:b w:val="1"/>
+                <w:bCs w:val="1"/>
+                <w:vertAlign w:val="baseline"/>
+              </w:rPr>
+            </w:pPr>
+            <w:r>
+              <w:rPr>
+                <w:rtl w:val="0"/>
+              </w:rPr>
+            </w:r>
+            <w:r>
+              <w:rPr>
+                <w:rFonts w:ascii="Roboto" w:cs="Roboto" w:eastAsia="Roboto" w:hAnsi="Roboto"/>
+              </w:rPr>
+              <w:t/>
+            </w:r>
+          </w:p>
+        </w:tc>
+      </w:tr>
+      <w:tr>
+        <w:trPr>
+          <w:cantSplit w:val="0"/>
+          <w:trHeight w:val="180" w:hRule="atLeast"/>
+          <w:tblHeader w:val="0"/>
+        </w:trPr>
+        <w:tc>
+          <w:tcPr>
+            <w:tcBorders>
+              <w:top w:color="000000" w:space="0" w:sz="6" w:val="single"/>
+              <w:left w:color="000000" w:space="0" w:sz="6" w:val="single"/>
+              <w:bottom w:color="000000" w:space="0" w:sz="6" w:val="single"/>
+              <w:right w:color="000000" w:space="0" w:sz="6" w:val="single"/>
+            </w:tcBorders>
+            <w:tcMar>
+              <w:top w:w="0.0" w:type="dxa"/>
+              <w:left w:w="40.0" w:type="dxa"/>
+              <w:bottom w:w="0.0" w:type="dxa"/>
+              <w:right w:w="40.0" w:type="dxa"/>
+            </w:tcMar>
+            <w:vAlign w:val="center"/>
+          </w:tcPr>
+          <w:p>
+            <w:pPr>
+              <w:pageBreakBefore w:val="0"/>
+              <w:widowControl w:val="0"/>
+              <w:spacing w:line="276" w:lineRule="auto"/>
+              <w:rPr>
+                <w:rFonts w:ascii="Roboto" w:cs="Roboto" w:eastAsia="Roboto" w:hAnsi="Roboto"/>
+                <w:b w:val="1"/>
+                <w:bCs w:val="1"/>
+              </w:rPr>
+            </w:pPr>
+            <w:r>
+              <w:rPr>
+                <w:rtl w:val="0"/>
+              </w:rPr>
+            </w:r>
+            <w:r>
+              <w:rPr>
+                <w:rFonts w:ascii="Roboto" w:cs="Roboto" w:eastAsia="Roboto" w:hAnsi="Roboto"/>
+              </w:rPr>
+              <w:t xml:space="preserve">Chlorella</w:t>
+            </w:r>
+          </w:p>
+        </w:tc>
+        <w:tc>
+          <w:tcPr>
+            <w:tcBorders>
+              <w:top w:color="000000" w:space="0" w:sz="6" w:val="single"/>
+              <w:left w:color="cccccc" w:space="0" w:sz="6" w:val="single"/>
+              <w:bottom w:color="000000" w:space="0" w:sz="6" w:val="single"/>
+              <w:right w:color="000000" w:space="0" w:sz="6" w:val="single"/>
+            </w:tcBorders>
+            <w:tcMar>
+              <w:top w:w="0.0" w:type="dxa"/>
+              <w:left w:w="40.0" w:type="dxa"/>
+              <w:bottom w:w="0.0" w:type="dxa"/>
+              <w:right w:w="40.0" w:type="dxa"/>
+            </w:tcMar>
+            <w:vAlign w:val="center"/>
+          </w:tcPr>
+          <w:p>
+            <w:pPr>
+              <w:pageBreakBefore w:val="0"/>
+              <w:widowControl w:val="0"/>
+              <w:spacing w:line="276" w:lineRule="auto"/>
+              <w:rPr>
+                <w:rFonts w:ascii="Roboto" w:cs="Roboto" w:eastAsia="Roboto" w:hAnsi="Roboto"/>
+                <w:b w:val="1"/>
+                <w:bCs w:val="1"/>
+              </w:rPr>
+            </w:pPr>
+            <w:r>
+              <w:rPr>
+                <w:rtl w:val="0"/>
+              </w:rPr>
+            </w:r>
+            <w:r>
+              <w:rPr>
+                <w:rFonts w:ascii="Roboto" w:cs="Roboto" w:eastAsia="Roboto" w:hAnsi="Roboto"/>
+              </w:rPr>
+              <w:t/>
+            </w:r>
+          </w:p>
+        </w:tc>
+        <w:tc>
+          <w:tcPr>
+            <w:vAlign w:val="top"/>
+          </w:tcPr>
+          <w:p>
+            <w:pPr>
+              <w:pageBreakBefore w:val="0"/>
+              <w:rPr>
+                <w:rFonts w:ascii="Roboto" w:cs="Roboto" w:eastAsia="Roboto" w:hAnsi="Roboto"/>
+                <w:b w:val="1"/>
+                <w:bCs w:val="1"/>
+                <w:vertAlign w:val="baseline"/>
+              </w:rPr>
+            </w:pPr>
+            <w:r>
+              <w:rPr>
+                <w:rtl w:val="0"/>
+              </w:rPr>
+            </w:r>
+            <w:r>
+              <w:rPr>
+                <w:rFonts w:ascii="Roboto" w:cs="Roboto" w:eastAsia="Roboto" w:hAnsi="Roboto"/>
+              </w:rPr>
+              <w:t/>
+            </w:r>
+          </w:p>
+        </w:tc>
+      </w:tr>
+      <w:tr>
+        <w:trPr>
+          <w:cantSplit w:val="0"/>
+          <w:trHeight w:val="180" w:hRule="atLeast"/>
+          <w:tblHeader w:val="0"/>
+        </w:trPr>
+        <w:tc>
+          <w:tcPr>
+            <w:tcBorders>
+              <w:top w:color="000000" w:space="0" w:sz="6" w:val="single"/>
+              <w:left w:color="000000" w:space="0" w:sz="6" w:val="single"/>
+              <w:bottom w:color="000000" w:space="0" w:sz="6" w:val="single"/>
+              <w:right w:color="000000" w:space="0" w:sz="6" w:val="single"/>
+            </w:tcBorders>
+            <w:tcMar>
+              <w:top w:w="0.0" w:type="dxa"/>
+              <w:left w:w="40.0" w:type="dxa"/>
+              <w:bottom w:w="0.0" w:type="dxa"/>
+              <w:right w:w="40.0" w:type="dxa"/>
+            </w:tcMar>
+            <w:vAlign w:val="center"/>
+          </w:tcPr>
+          <w:p>
+            <w:pPr>
+              <w:pageBreakBefore w:val="0"/>
+              <w:widowControl w:val="0"/>
+              <w:spacing w:line="276" w:lineRule="auto"/>
+              <w:rPr>
+                <w:rFonts w:ascii="Roboto" w:cs="Roboto" w:eastAsia="Roboto" w:hAnsi="Roboto"/>
+                <w:b w:val="1"/>
+                <w:bCs w:val="1"/>
+              </w:rPr>
+            </w:pPr>
+            <w:r>
+              <w:rPr>
+                <w:rtl w:val="0"/>
+              </w:rPr>
+            </w:r>
+            <w:r>
+              <w:rPr>
+                <w:rFonts w:ascii="Roboto" w:cs="Roboto" w:eastAsia="Roboto" w:hAnsi="Roboto"/>
+              </w:rPr>
+              <w:t xml:space="preserve">Cataplexy</w:t>
             </w:r>
           </w:p>
         </w:tc>

</xml_diff>